<commit_message>
B2: the declared lexis sets must not repeat, and now the harness checks it
The plan declares one phrasal-verb set and one word-formation set per
unit, each marked "declared, and not repeated in another unit". Three
repeats had got through:

  take out        Unit 1 and Unit 2   -> Unit 2 now answers for
  set out         Unit 2 and Unit 3   -> Unit 3 now brings up
  assume          Unit 1 and Unit 3   -> Unit 3 now qualify/qualification

The harness now reads every other unit in the tree and fails the sweep on
any repeat, so the lexical syllabus cannot silently overlap as the book
fills up. It also checks the declared sizes — 10-12 phrasal verbs and
8-10 word-formation pairs.

Units 1, 2 and 3 rebuilt and re-swept: 47, 46 and 46 pages, all PASS.

Co-Authored-By: Claude Opus 5 <noreply@anthropic.com>
Claude-Session: https://claude.ai/code/session_01Qyh7uRVsiebNero71esRN8
</commit_message>
<xml_diff>
--- a/proactive-english-b2-sy/out/PE-B2-BK1-SY_Unit03_StudentsBook.docx
+++ b/proactive-english-b2-sy/out/PE-B2-BK1-SY_Unit03_StudentsBook.docx
@@ -33718,7 +33718,7 @@
                 <w:sz w:val="22"/>
                 <w:szCs w:val="22"/>
               </w:rPr>
-              <w:t xml:space="preserve">set out · put forward · back up · bear out · rule out · stand by · give ground · hold back · follow through · point out · allow for · come round to</w:t>
+              <w:t xml:space="preserve">bring up · put forward · back up · bear out · rule out · stand by · give ground · hold back · follow through · point out · allow for · come round to</w:t>
             </w:r>
             <w:r>
               <w:rPr>
@@ -33843,7 +33843,7 @@
                 <w:sz w:val="22"/>
                 <w:szCs w:val="22"/>
               </w:rPr>
-              <w:t xml:space="preserve"> · assume → </w:t>
+              <w:t xml:space="preserve"> · qualify → </w:t>
             </w:r>
             <w:r>
               <w:rPr>
@@ -33855,7 +33855,7 @@
                 <w:sz w:val="22"/>
                 <w:szCs w:val="22"/>
               </w:rPr>
-              <w:t xml:space="preserve">assumption</w:t>
+              <w:t xml:space="preserve">qualification</w:t>
             </w:r>
             <w:r>
               <w:rPr>

</xml_diff>